<commit_message>
Update code and templates, including documentation and new views
</commit_message>
<xml_diff>
--- a/templates/刑事辩护/10办案小结-诉讼类.docx
+++ b/templates/刑事辩护/10办案小结-诉讼类.docx
@@ -138,7 +138,7 @@
                 <w:rFonts w:hint="default" w:ascii="SimHei" w:hAnsi="SimHei" w:eastAsia="SimHei"/>
                 <w:sz w:val="24"/>
               </w:rPr>
-              <w:t>{{二委托人}}</w:t>
+              <w:t>{{_2委托人}}</w:t>
             </w:r>
           </w:p>
         </w:tc>
@@ -210,7 +210,7 @@
                 <w:rFonts w:hint="default" w:ascii="SimHei" w:hAnsi="SimHei" w:eastAsia="SimHei"/>
                 <w:sz w:val="24"/>
               </w:rPr>
-              <w:t>{{九案由}}</w:t>
+              <w:t>{{_9案由}}</w:t>
             </w:r>
           </w:p>
         </w:tc>
@@ -265,7 +265,7 @@
                 <w:rFonts w:hint="default" w:ascii="SimHei" w:hAnsi="SimHei" w:eastAsia="SimHei"/>
                 <w:sz w:val="24"/>
               </w:rPr>
-              <w:t>{{一委托日期}}</w:t>
+              <w:t>{{_1委托日期}}</w:t>
             </w:r>
           </w:p>
         </w:tc>
@@ -450,7 +450,7 @@
                 <w:rFonts w:hint="default" w:ascii="SimHei" w:hAnsi="SimHei" w:eastAsia="SimHei"/>
                 <w:sz w:val="24"/>
               </w:rPr>
-              <w:t>{{一委托日期}}</w:t>
+              <w:t>{{_1委托日期}}</w:t>
             </w:r>
           </w:p>
         </w:tc>

</xml_diff>